<commit_message>
Handbook v1.3: promote the three denominator caveats to a finding
They were distributed across 49.2 (T1), 49.4 (T2) and 49.6 (U1) as
caveats attached to their own experiments. Collected into 49.8 they are
something else: three headline numbers, three experiments, three
metrics, three different checks that found them -- and in every case the
arithmetic was correct and the metric itself gave no signal.

That generalises past ECG, which the individual caveats do not, so it
belongs in the findings rather than the limitations. The exec summary
points at it. NOT SUPPORTED moves to 49.9.

Appendix A claim 23 already made the contributing-count rule binding for
this programme; 49.8 is the evidence for why it should be.
</commit_message>
<xml_diff>
--- a/docs/CardioSentinel_Research_Execution_Handbook_v1.3.docx
+++ b/docs/CardioSentinel_Research_Execution_Handbook_v1.3.docx
@@ -337,6 +337,27 @@
     <w:p>
       <w:r>
         <w:t>test. Everything else is consumed. §51 is the ledger, and it is the most decision-relevant page in this document.</w:t>
+      </w:r>
+    </w:p>
+    <w:p>
+      <w:r>
+        <w:rPr>
+          <w:b/>
+        </w:rPr>
+        <w:t>One finding generalises past ECG.</w:t>
+      </w:r>
+      <w:r>
+        <w:t xml:space="preserve"> Three headline numbers — T1's subject-macro </w:t>
+      </w:r>
+      <w:r>
+        <w:rPr>
+          <w:rFonts w:ascii="Consolas" w:hAnsi="Consolas"/>
+          <w:sz w:val="18"/>
+        </w:rPr>
+        <w:t>episode_f1</w:t>
+      </w:r>
+      <w:r>
+        <w:t>, T2's subject-macro AUPRC, U1's ECE — each concealed a denominator that was not what it looked like, in three different experiments, found by three different checks, and never by the metric itself. §49.8.</w:t>
       </w:r>
     </w:p>
     <w:p>
@@ -10780,7 +10801,307 @@
         <w:pStyle w:val="Heading2"/>
       </w:pPr>
       <w:r>
-        <w:t>49.8 NOT SUPPORTED</w:t>
+        <w:t>49.8 Three headline numbers whose denominator is not what it looks like</w:t>
+      </w:r>
+    </w:p>
+    <w:p>
+      <w:r>
+        <w:rPr>
+          <w:b/>
+        </w:rPr>
+        <w:t>This is a finding, not a limitations list</w:t>
+      </w:r>
+      <w:r>
+        <w:t>, and it is the one a methodology paper can generalise from. Three of the programme's headline figures came from three different experiments, three different teams of assumptions, and three different metrics — and all three concealed the same defect until someone looked underneath.</w:t>
+      </w:r>
+    </w:p>
+    <w:tbl>
+      <w:tblPr>
+        <w:tblStyle w:val="TableGrid"/>
+        <w:tblW w:type="auto" w:w="0"/>
+        <w:tblLook w:firstColumn="1" w:firstRow="1" w:lastColumn="0" w:lastRow="0" w:noHBand="0" w:noVBand="1" w:val="04A0"/>
+      </w:tblPr>
+      <w:tblGrid>
+        <w:gridCol w:w="3437"/>
+        <w:gridCol w:w="3437"/>
+        <w:gridCol w:w="3437"/>
+      </w:tblGrid>
+      <w:tr>
+        <w:tc>
+          <w:tcPr>
+            <w:tcW w:type="dxa" w:w="3437"/>
+          </w:tcPr>
+          <w:p>
+            <w:r>
+              <w:rPr>
+                <w:b/>
+              </w:rPr>
+              <w:t>Experiment</w:t>
+            </w:r>
+          </w:p>
+        </w:tc>
+        <w:tc>
+          <w:tcPr>
+            <w:tcW w:type="dxa" w:w="3437"/>
+          </w:tcPr>
+          <w:p>
+            <w:r>
+              <w:rPr>
+                <w:b/>
+              </w:rPr>
+              <w:t>The headline</w:t>
+            </w:r>
+          </w:p>
+        </w:tc>
+        <w:tc>
+          <w:tcPr>
+            <w:tcW w:type="dxa" w:w="3437"/>
+          </w:tcPr>
+          <w:p>
+            <w:r>
+              <w:rPr>
+                <w:b/>
+              </w:rPr>
+              <w:t>What the denominator actually is</w:t>
+            </w:r>
+          </w:p>
+        </w:tc>
+      </w:tr>
+      <w:tr>
+        <w:tc>
+          <w:tcPr>
+            <w:tcW w:type="dxa" w:w="3437"/>
+          </w:tcPr>
+          <w:p>
+            <w:r>
+              <w:rPr>
+                <w:b/>
+              </w:rPr>
+              <w:t>T1</w:t>
+            </w:r>
+          </w:p>
+        </w:tc>
+        <w:tc>
+          <w:tcPr>
+            <w:tcW w:type="dxa" w:w="3437"/>
+          </w:tcPr>
+          <w:p>
+            <w:r>
+              <w:t xml:space="preserve">subject-macro </w:t>
+            </w:r>
+            <w:r>
+              <w:rPr>
+                <w:rFonts w:ascii="Consolas" w:hAnsi="Consolas"/>
+                <w:sz w:val="18"/>
+              </w:rPr>
+              <w:t>episode_f1</w:t>
+            </w:r>
+            <w:r>
+              <w:t xml:space="preserve"> </w:t>
+            </w:r>
+            <w:r>
+              <w:rPr>
+                <w:b/>
+              </w:rPr>
+              <w:t>0.2524</w:t>
+            </w:r>
+            <w:r>
+              <w:t xml:space="preserve"> over 12 subjects</w:t>
+            </w:r>
+          </w:p>
+        </w:tc>
+        <w:tc>
+          <w:tcPr>
+            <w:tcW w:type="dxa" w:w="3437"/>
+          </w:tcPr>
+          <w:p>
+            <w:r>
+              <w:rPr>
+                <w:b/>
+              </w:rPr>
+              <w:t>Defined for 12, meaningful for 9.</w:t>
+            </w:r>
+            <w:r>
+              <w:t xml:space="preserve"> Three subjects have </w:t>
+            </w:r>
+            <w:r>
+              <w:rPr>
+                <w:i/>
+              </w:rPr>
+              <w:t>no reference episodes at all</w:t>
+            </w:r>
+            <w:r>
+              <w:t xml:space="preserve">, so their zero is a false-alarm penalty, not a detection failure — and it pushes the operating point in the </w:t>
+            </w:r>
+            <w:r>
+              <w:rPr>
+                <w:i/>
+              </w:rPr>
+              <w:t>opposite</w:t>
+            </w:r>
+            <w:r>
+              <w:t xml:space="preserve"> direction from the four genuine misses (§49.2)</w:t>
+            </w:r>
+          </w:p>
+        </w:tc>
+      </w:tr>
+      <w:tr>
+        <w:tc>
+          <w:tcPr>
+            <w:tcW w:type="dxa" w:w="3437"/>
+          </w:tcPr>
+          <w:p>
+            <w:r>
+              <w:rPr>
+                <w:b/>
+              </w:rPr>
+              <w:t>T2</w:t>
+            </w:r>
+          </w:p>
+        </w:tc>
+        <w:tc>
+          <w:tcPr>
+            <w:tcW w:type="dxa" w:w="3437"/>
+          </w:tcPr>
+          <w:p>
+            <w:r>
+              <w:t xml:space="preserve">subject-macro AUPRC </w:t>
+            </w:r>
+            <w:r>
+              <w:rPr>
+                <w:b/>
+              </w:rPr>
+              <w:t>0.428152</w:t>
+            </w:r>
+          </w:p>
+        </w:tc>
+        <w:tc>
+          <w:tcPr>
+            <w:tcW w:type="dxa" w:w="3437"/>
+          </w:tcPr>
+          <w:p>
+            <w:r>
+              <w:t xml:space="preserve">A mean over </w:t>
+            </w:r>
+            <w:r>
+              <w:rPr>
+                <w:b/>
+              </w:rPr>
+              <w:t>9 of 12</w:t>
+            </w:r>
+            <w:r>
+              <w:t xml:space="preserve"> subjects, both arms. </w:t>
+            </w:r>
+            <w:r>
+              <w:rPr>
+                <w:rFonts w:ascii="Consolas" w:hAnsi="Consolas"/>
+                <w:sz w:val="18"/>
+              </w:rPr>
+              <w:t>non_contributing_subject_count: 3</w:t>
+            </w:r>
+            <w:r>
+              <w:t xml:space="preserve"> is in the artifact (§49.4)</w:t>
+            </w:r>
+          </w:p>
+        </w:tc>
+      </w:tr>
+      <w:tr>
+        <w:tc>
+          <w:tcPr>
+            <w:tcW w:type="dxa" w:w="3437"/>
+          </w:tcPr>
+          <w:p>
+            <w:r>
+              <w:rPr>
+                <w:b/>
+              </w:rPr>
+              <w:t>U1</w:t>
+            </w:r>
+          </w:p>
+        </w:tc>
+        <w:tc>
+          <w:tcPr>
+            <w:tcW w:type="dxa" w:w="3437"/>
+          </w:tcPr>
+          <w:p>
+            <w:r>
+              <w:t xml:space="preserve">ECE equal-width </w:t>
+            </w:r>
+            <w:r>
+              <w:rPr>
+                <w:b/>
+              </w:rPr>
+              <w:t>0.016991</w:t>
+            </w:r>
+          </w:p>
+        </w:tc>
+        <w:tc>
+          <w:tcPr>
+            <w:tcW w:type="dxa" w:w="3437"/>
+          </w:tcPr>
+          <w:p>
+            <w:r>
+              <w:t xml:space="preserve">Carried by one bin: equal-width bin 0 holds </w:t>
+            </w:r>
+            <w:r>
+              <w:rPr>
+                <w:b/>
+              </w:rPr>
+              <w:t>398,513 of 473,897 rows</w:t>
+            </w:r>
+            <w:r>
+              <w:t>. The calibrator is well-behaved where almost all the mass is and over-predicts badly where a clinician would act (§49.6)</w:t>
+            </w:r>
+          </w:p>
+        </w:tc>
+      </w:tr>
+    </w:tbl>
+    <w:p>
+      <w:r>
+        <w:rPr>
+          <w:b/>
+        </w:rPr>
+        <w:t>Three for three.</w:t>
+      </w:r>
+      <w:r>
+        <w:t xml:space="preserve"> Each was found by a different check, none by the metric itself, and in each case the summary statistic was </w:t>
+      </w:r>
+      <w:r>
+        <w:rPr>
+          <w:i/>
+        </w:rPr>
+        <w:t>correctly computed</w:t>
+      </w:r>
+      <w:r>
+        <w:t xml:space="preserve"> — the arithmetic was never wrong. </w:t>
+      </w:r>
+      <w:r>
+        <w:rPr>
+          <w:b/>
+        </w:rPr>
+        <w:t>Availability analysis that asks only "is this metric defined?" catches none of them.</w:t>
+      </w:r>
+      <w:r>
+        <w:t xml:space="preserve"> §46.1 requires both checks because T1 taught the lesson; T2 and U1 are the evidence that the lesson generalises past the experiment that produced it.</w:t>
+      </w:r>
+    </w:p>
+    <w:p>
+      <w:r>
+        <w:rPr>
+          <w:b/>
+        </w:rPr>
+        <w:t>The methodological claim this supports</w:t>
+      </w:r>
+      <w:r>
+        <w:t xml:space="preserve"> — and it is a claim about method, not about ECG — is that a scalar summary over a heterogeneous population needs its contributing-unit count reported beside it as a matter of course, not as a caveat added when someone happens to check. Appendix A claim 23 makes that binding for this programme.</w:t>
+      </w:r>
+    </w:p>
+    <w:p>
+      <w:pPr>
+        <w:pStyle w:val="Heading2"/>
+      </w:pPr>
+      <w:r>
+        <w:t>49.9 NOT SUPPORTED</w:t>
       </w:r>
     </w:p>
     <w:p>

</xml_diff>

<commit_message>
Handbook v1.3: date the revision the day it lands
The merge commits for #76, #77 and #78 read 2026-08-23 in the
repository's own log. A source-of-truth document dated the day before
the merges it describes is the exact drift this revision exists to fix.

Four dates advanced: the header, the 0.3 revision-log row, 39's snapshot
heading, and the footer. Five left alone deliberately -- v1.0/v1.1
location dates, the pre-v1.2 audit date, v1.2's own row, and the S3
snapshot prefix, which is a real object-store prefix name and not a date
reference.
</commit_message>
<xml_diff>
--- a/docs/CardioSentinel_Research_Execution_Handbook_v1.3.docx
+++ b/docs/CardioSentinel_Research_Execution_Handbook_v1.3.docx
@@ -27,7 +27,7 @@
         <w:t>Date:</w:t>
       </w:r>
       <w:r>
-        <w:t xml:space="preserve"> 2026-08-22 · </w:t>
+        <w:t xml:space="preserve"> 2026-08-23 · </w:t>
       </w:r>
       <w:r>
         <w:rPr>
@@ -848,7 +848,7 @@
               <w:rPr>
                 <w:b/>
               </w:rPr>
-              <w:t>22 Aug 2026</w:t>
+              <w:t>23 Aug 2026</w:t>
             </w:r>
           </w:p>
         </w:tc>
@@ -3744,7 +3744,7 @@
         <w:pStyle w:val="Heading1"/>
       </w:pPr>
       <w:r>
-        <w:t>§39 Current execution snapshot — 22 August 2026</w:t>
+        <w:t>§39 Current execution snapshot — 23 August 2026</w:t>
       </w:r>
     </w:p>
     <w:p>
@@ -14948,7 +14948,7 @@
         <w:t>d5a86ce</w:t>
       </w:r>
       <w:r>
-        <w:t xml:space="preserve"> on 2026-08-22._</w:t>
+        <w:t xml:space="preserve"> on 2026-08-23._</w:t>
       </w:r>
     </w:p>
     <w:p>

</xml_diff>